<commit_message>
feat: add Helm chart for Kubernetes deployment
Add a proper Helm chart at deployment/helm/heart-api/ with templated
manifests for Deployment, Service, HPA and Ingress. Update the report
Section 8 to document the Helm chart structure and usage.
</commit_message>
<xml_diff>
--- a/reports/MLOps_Assignment_01_Final_Report.docx
+++ b/reports/MLOps_Assignment_01_Final_Report.docx
@@ -3399,6 +3399,290 @@
     </w:p>
     <w:p>
       <w:pPr>
+        <w:pStyle w:val="Heading2"/>
+        <w:spacing w:after="120" w:before="300"/>
+      </w:pPr>
+      <w:r>
+        <w:rPr>
+          <w:rFonts w:ascii="Calibri" w:cs="Calibri" w:eastAsia="Calibri" w:hAnsi="Calibri"/>
+          <w:b/>
+          <w:bCs/>
+          <w:color w:val="1a1a2e"/>
+        </w:rPr>
+        <w:t xml:space="preserve">8.2 Helm Chart</w:t>
+      </w:r>
+    </w:p>
+    <w:p>
+      <w:pPr>
+        <w:spacing w:after="120" w:line="276"/>
+      </w:pPr>
+      <w:r>
+        <w:rPr>
+          <w:rFonts w:ascii="Calibri" w:cs="Calibri" w:eastAsia="Calibri" w:hAnsi="Calibri"/>
+          <w:color w:val="333333"/>
+          <w:sz w:val="22"/>
+          <w:szCs w:val="22"/>
+        </w:rPr>
+        <w:t xml:space="preserve">In addition to raw manifests, a Helm chart is provided at deployment/helm/heart-api/ for templated, configurable deployments. The chart packages all four Kubernetes resources (Deployment, Service, HPA, Ingress) with a single values.yaml that parameterises image, replicas, resources, autoscaling thresholds, probe paths, and Prometheus annotations.</w:t>
+      </w:r>
+    </w:p>
+    <w:p>
+      <w:pPr>
+        <w:spacing w:after="100" w:line="276"/>
+      </w:pPr>
+      <w:r>
+        <w:rPr>
+          <w:rFonts w:ascii="Calibri" w:cs="Calibri" w:eastAsia="Calibri" w:hAnsi="Calibri"/>
+          <w:b/>
+          <w:bCs/>
+          <w:sz w:val="22"/>
+          <w:szCs w:val="22"/>
+        </w:rPr>
+        <w:t xml:space="preserve">Chart structure:</w:t>
+      </w:r>
+      <w:r>
+        <w:rPr>
+          <w:rFonts w:ascii="Calibri" w:cs="Calibri" w:eastAsia="Calibri" w:hAnsi="Calibri"/>
+          <w:color w:val="333333"/>
+          <w:sz w:val="22"/>
+          <w:szCs w:val="22"/>
+        </w:rPr>
+        <w:t xml:space="preserve"/>
+      </w:r>
+    </w:p>
+    <w:p>
+      <w:pPr>
+        <w:spacing w:after="80"/>
+      </w:pPr>
+      <w:r>
+        <w:rPr>
+          <w:rFonts w:ascii="Consolas" w:cs="Consolas" w:eastAsia="Consolas" w:hAnsi="Consolas"/>
+          <w:color w:val="2d2d2d"/>
+          <w:sz w:val="18"/>
+          <w:szCs w:val="18"/>
+        </w:rPr>
+        <w:t xml:space="preserve">deployment/helm/heart-api/</w:t>
+      </w:r>
+    </w:p>
+    <w:p>
+      <w:pPr>
+        <w:spacing w:after="80"/>
+      </w:pPr>
+      <w:r>
+        <w:rPr>
+          <w:rFonts w:ascii="Consolas" w:cs="Consolas" w:eastAsia="Consolas" w:hAnsi="Consolas"/>
+          <w:color w:val="2d2d2d"/>
+          <w:sz w:val="18"/>
+          <w:szCs w:val="18"/>
+        </w:rPr>
+        <w:t xml:space="preserve">├── Chart.yaml              # Chart metadata (v1.0.0)</w:t>
+      </w:r>
+    </w:p>
+    <w:p>
+      <w:pPr>
+        <w:spacing w:after="80"/>
+      </w:pPr>
+      <w:r>
+        <w:rPr>
+          <w:rFonts w:ascii="Consolas" w:cs="Consolas" w:eastAsia="Consolas" w:hAnsi="Consolas"/>
+          <w:color w:val="2d2d2d"/>
+          <w:sz w:val="18"/>
+          <w:szCs w:val="18"/>
+        </w:rPr>
+        <w:t xml:space="preserve">├── values.yaml             # Default configuration values</w:t>
+      </w:r>
+    </w:p>
+    <w:p>
+      <w:pPr>
+        <w:spacing w:after="80"/>
+      </w:pPr>
+      <w:r>
+        <w:rPr>
+          <w:rFonts w:ascii="Consolas" w:cs="Consolas" w:eastAsia="Consolas" w:hAnsi="Consolas"/>
+          <w:color w:val="2d2d2d"/>
+          <w:sz w:val="18"/>
+          <w:szCs w:val="18"/>
+        </w:rPr>
+        <w:t xml:space="preserve">└── templates/</w:t>
+      </w:r>
+    </w:p>
+    <w:p>
+      <w:pPr>
+        <w:spacing w:after="80"/>
+      </w:pPr>
+      <w:r>
+        <w:rPr>
+          <w:rFonts w:ascii="Consolas" w:cs="Consolas" w:eastAsia="Consolas" w:hAnsi="Consolas"/>
+          <w:color w:val="2d2d2d"/>
+          <w:sz w:val="18"/>
+          <w:szCs w:val="18"/>
+        </w:rPr>
+        <w:t xml:space="preserve">    ├── _helpers.tpl        # Common label definitions</w:t>
+      </w:r>
+    </w:p>
+    <w:p>
+      <w:pPr>
+        <w:spacing w:after="80"/>
+      </w:pPr>
+      <w:r>
+        <w:rPr>
+          <w:rFonts w:ascii="Consolas" w:cs="Consolas" w:eastAsia="Consolas" w:hAnsi="Consolas"/>
+          <w:color w:val="2d2d2d"/>
+          <w:sz w:val="18"/>
+          <w:szCs w:val="18"/>
+        </w:rPr>
+        <w:t xml:space="preserve">    ├── deployment.yaml     # Templated Deployment</w:t>
+      </w:r>
+    </w:p>
+    <w:p>
+      <w:pPr>
+        <w:spacing w:after="80"/>
+      </w:pPr>
+      <w:r>
+        <w:rPr>
+          <w:rFonts w:ascii="Consolas" w:cs="Consolas" w:eastAsia="Consolas" w:hAnsi="Consolas"/>
+          <w:color w:val="2d2d2d"/>
+          <w:sz w:val="18"/>
+          <w:szCs w:val="18"/>
+        </w:rPr>
+        <w:t xml:space="preserve">    ├── service.yaml        # Templated Service</w:t>
+      </w:r>
+    </w:p>
+    <w:p>
+      <w:pPr>
+        <w:spacing w:after="80"/>
+      </w:pPr>
+      <w:r>
+        <w:rPr>
+          <w:rFonts w:ascii="Consolas" w:cs="Consolas" w:eastAsia="Consolas" w:hAnsi="Consolas"/>
+          <w:color w:val="2d2d2d"/>
+          <w:sz w:val="18"/>
+          <w:szCs w:val="18"/>
+        </w:rPr>
+        <w:t xml:space="preserve">    ├── hpa.yaml            # Conditional HPA (autoscaling.enabled)</w:t>
+      </w:r>
+    </w:p>
+    <w:p>
+      <w:pPr>
+        <w:spacing w:after="80"/>
+      </w:pPr>
+      <w:r>
+        <w:rPr>
+          <w:rFonts w:ascii="Consolas" w:cs="Consolas" w:eastAsia="Consolas" w:hAnsi="Consolas"/>
+          <w:color w:val="2d2d2d"/>
+          <w:sz w:val="18"/>
+          <w:szCs w:val="18"/>
+        </w:rPr>
+        <w:t xml:space="preserve">    └── ingress.yaml        # Conditional Ingress (ingress.enabled)</w:t>
+      </w:r>
+    </w:p>
+    <w:p>
+      <w:pPr>
+        <w:spacing w:after="100" w:line="276"/>
+      </w:pPr>
+      <w:r>
+        <w:rPr>
+          <w:rFonts w:ascii="Calibri" w:cs="Calibri" w:eastAsia="Calibri" w:hAnsi="Calibri"/>
+          <w:b/>
+          <w:bCs/>
+          <w:sz w:val="22"/>
+          <w:szCs w:val="22"/>
+        </w:rPr>
+        <w:t xml:space="preserve">Key values.yaml defaults: </w:t>
+      </w:r>
+      <w:r>
+        <w:rPr>
+          <w:rFonts w:ascii="Calibri" w:cs="Calibri" w:eastAsia="Calibri" w:hAnsi="Calibri"/>
+          <w:color w:val="333333"/>
+          <w:sz w:val="22"/>
+          <w:szCs w:val="22"/>
+        </w:rPr>
+        <w:t xml:space="preserve">replicaCount=2, service.type=LoadBalancer, autoscaling min=2 max=5 at 70% CPU, ingress host=heart-api.local, Prometheus scrape enabled.</w:t>
+      </w:r>
+    </w:p>
+    <w:p>
+      <w:pPr>
+        <w:spacing w:after="100" w:line="276"/>
+      </w:pPr>
+      <w:r>
+        <w:rPr>
+          <w:rFonts w:ascii="Calibri" w:cs="Calibri" w:eastAsia="Calibri" w:hAnsi="Calibri"/>
+          <w:b/>
+          <w:bCs/>
+          <w:sz w:val="22"/>
+          <w:szCs w:val="22"/>
+        </w:rPr>
+        <w:t xml:space="preserve">Deploy with Helm:</w:t>
+      </w:r>
+      <w:r>
+        <w:rPr>
+          <w:rFonts w:ascii="Calibri" w:cs="Calibri" w:eastAsia="Calibri" w:hAnsi="Calibri"/>
+          <w:color w:val="333333"/>
+          <w:sz w:val="22"/>
+          <w:szCs w:val="22"/>
+        </w:rPr>
+        <w:t xml:space="preserve"/>
+      </w:r>
+    </w:p>
+    <w:p>
+      <w:pPr>
+        <w:spacing w:after="80"/>
+      </w:pPr>
+      <w:r>
+        <w:rPr>
+          <w:rFonts w:ascii="Consolas" w:cs="Consolas" w:eastAsia="Consolas" w:hAnsi="Consolas"/>
+          <w:color w:val="2d2d2d"/>
+          <w:sz w:val="18"/>
+          <w:szCs w:val="18"/>
+        </w:rPr>
+        <w:t xml:space="preserve">helm install heart-api deployment/helm/heart-api/</w:t>
+      </w:r>
+    </w:p>
+    <w:p>
+      <w:pPr>
+        <w:spacing w:after="80"/>
+      </w:pPr>
+      <w:r>
+        <w:rPr>
+          <w:rFonts w:ascii="Consolas" w:cs="Consolas" w:eastAsia="Consolas" w:hAnsi="Consolas"/>
+          <w:color w:val="2d2d2d"/>
+          <w:sz w:val="18"/>
+          <w:szCs w:val="18"/>
+        </w:rPr>
+        <w:t xml:space="preserve">helm install heart-api deployment/helm/heart-api/ --set image.tag=v2.0</w:t>
+      </w:r>
+    </w:p>
+    <w:p>
+      <w:pPr>
+        <w:spacing w:after="120" w:line="276"/>
+      </w:pPr>
+      <w:r>
+        <w:rPr>
+          <w:rFonts w:ascii="Calibri" w:cs="Calibri" w:eastAsia="Calibri" w:hAnsi="Calibri"/>
+          <w:color w:val="333333"/>
+          <w:sz w:val="22"/>
+          <w:szCs w:val="22"/>
+        </w:rPr>
+        <w:t xml:space="preserve">The Helm chart provides the same deployment as the raw manifests but adds configurability — teams can override any value at install time without editing YAML files, making it suitable for multi-environment deployments (dev, staging, production).</w:t>
+      </w:r>
+    </w:p>
+    <w:p>
+      <w:pPr>
+        <w:pStyle w:val="Heading2"/>
+        <w:spacing w:after="120" w:before="300"/>
+      </w:pPr>
+      <w:r>
+        <w:rPr>
+          <w:rFonts w:ascii="Calibri" w:cs="Calibri" w:eastAsia="Calibri" w:hAnsi="Calibri"/>
+          <w:b/>
+          <w:bCs/>
+          <w:color w:val="1a1a2e"/>
+        </w:rPr>
+        <w:t xml:space="preserve">8.3 CI Validation</w:t>
+      </w:r>
+    </w:p>
+    <w:p>
+      <w:pPr>
         <w:spacing w:after="120" w:line="276"/>
       </w:pPr>
       <w:r>
@@ -4063,7 +4347,7 @@
           <w:sz w:val="22"/>
           <w:szCs w:val="22"/>
         </w:rPr>
-        <w:t xml:space="preserve">Kubernetes:</w:t>
+        <w:t xml:space="preserve">Kubernetes (raw manifests):</w:t>
       </w:r>
       <w:r>
         <w:rPr>
@@ -4143,7 +4427,7 @@
           <w:sz w:val="22"/>
           <w:szCs w:val="22"/>
         </w:rPr>
-        <w:t xml:space="preserve">Monitoring:</w:t>
+        <w:t xml:space="preserve">Kubernetes (Helm chart):</w:t>
       </w:r>
       <w:r>
         <w:rPr>
@@ -4166,6 +4450,44 @@
           <w:sz w:val="18"/>
           <w:szCs w:val="18"/>
         </w:rPr>
+        <w:t xml:space="preserve">helm install heart-api deployment/helm/heart-api/</w:t>
+      </w:r>
+    </w:p>
+    <w:p>
+      <w:pPr>
+        <w:spacing w:after="100" w:line="276"/>
+      </w:pPr>
+      <w:r>
+        <w:rPr>
+          <w:rFonts w:ascii="Calibri" w:cs="Calibri" w:eastAsia="Calibri" w:hAnsi="Calibri"/>
+          <w:b/>
+          <w:bCs/>
+          <w:sz w:val="22"/>
+          <w:szCs w:val="22"/>
+        </w:rPr>
+        <w:t xml:space="preserve">Monitoring:</w:t>
+      </w:r>
+      <w:r>
+        <w:rPr>
+          <w:rFonts w:ascii="Calibri" w:cs="Calibri" w:eastAsia="Calibri" w:hAnsi="Calibri"/>
+          <w:color w:val="333333"/>
+          <w:sz w:val="22"/>
+          <w:szCs w:val="22"/>
+        </w:rPr>
+        <w:t xml:space="preserve"/>
+      </w:r>
+    </w:p>
+    <w:p>
+      <w:pPr>
+        <w:spacing w:after="80"/>
+      </w:pPr>
+      <w:r>
+        <w:rPr>
+          <w:rFonts w:ascii="Consolas" w:cs="Consolas" w:eastAsia="Consolas" w:hAnsi="Consolas"/>
+          <w:color w:val="2d2d2d"/>
+          <w:sz w:val="18"/>
+          <w:szCs w:val="18"/>
+        </w:rPr>
         <w:t xml:space="preserve">docker compose -f monitoring/docker-compose.monitoring.yml up --build</w:t>
       </w:r>
     </w:p>
@@ -4307,7 +4629,7 @@
           <w:sz w:val="16"/>
           <w:szCs w:val="16"/>
         </w:rPr>
-        <w:t xml:space="preserve">├── deployment/                             # K8s manifests</w:t>
+        <w:t xml:space="preserve">├── deployment/                             # K8s manifests &amp; Helm chart</w:t>
       </w:r>
     </w:p>
     <w:p>
@@ -4363,7 +4685,63 @@
           <w:sz w:val="16"/>
           <w:szCs w:val="16"/>
         </w:rPr>
-        <w:t xml:space="preserve">│   └── ingress.yaml                        #   nginx Ingress</w:t>
+        <w:t xml:space="preserve">│   ├── ingress.yaml                        #   nginx Ingress</w:t>
+      </w:r>
+    </w:p>
+    <w:p>
+      <w:pPr>
+        <w:spacing w:after="20"/>
+      </w:pPr>
+      <w:r>
+        <w:rPr>
+          <w:rFonts w:ascii="Consolas" w:cs="Consolas" w:eastAsia="Consolas" w:hAnsi="Consolas"/>
+          <w:color w:val="2d2d2d"/>
+          <w:sz w:val="16"/>
+          <w:szCs w:val="16"/>
+        </w:rPr>
+        <w:t xml:space="preserve">│   └── helm/heart-api/                     #   Helm chart</w:t>
+      </w:r>
+    </w:p>
+    <w:p>
+      <w:pPr>
+        <w:spacing w:after="20"/>
+      </w:pPr>
+      <w:r>
+        <w:rPr>
+          <w:rFonts w:ascii="Consolas" w:cs="Consolas" w:eastAsia="Consolas" w:hAnsi="Consolas"/>
+          <w:color w:val="2d2d2d"/>
+          <w:sz w:val="16"/>
+          <w:szCs w:val="16"/>
+        </w:rPr>
+        <w:t xml:space="preserve">│       ├── Chart.yaml                      #     Chart metadata</w:t>
+      </w:r>
+    </w:p>
+    <w:p>
+      <w:pPr>
+        <w:spacing w:after="20"/>
+      </w:pPr>
+      <w:r>
+        <w:rPr>
+          <w:rFonts w:ascii="Consolas" w:cs="Consolas" w:eastAsia="Consolas" w:hAnsi="Consolas"/>
+          <w:color w:val="2d2d2d"/>
+          <w:sz w:val="16"/>
+          <w:szCs w:val="16"/>
+        </w:rPr>
+        <w:t xml:space="preserve">│       ├── values.yaml                     #     Default values</w:t>
+      </w:r>
+    </w:p>
+    <w:p>
+      <w:pPr>
+        <w:spacing w:after="20"/>
+      </w:pPr>
+      <w:r>
+        <w:rPr>
+          <w:rFonts w:ascii="Consolas" w:cs="Consolas" w:eastAsia="Consolas" w:hAnsi="Consolas"/>
+          <w:color w:val="2d2d2d"/>
+          <w:sz w:val="16"/>
+          <w:szCs w:val="16"/>
+        </w:rPr>
+        <w:t xml:space="preserve">│       └── templates/                      #     Templated manifests</w:t>
       </w:r>
     </w:p>
     <w:p>

</xml_diff>

<commit_message>
docs: add pipeline demo video link and live API URL to report
Added Section 13 (Pipeline Demo Video) with GitHub video link
and Section 14 (Live Public API Deployment) with Render URLs.

Co-Authored-By: Claude Opus 4.6 <noreply@anthropic.com>
Claude-Session: https://claude.ai/code/session_01RNBTeDu5BDurzfd9a5VVKW
</commit_message>
<xml_diff>
--- a/reports/MLOps_Assignment_01_Final_Report.docx
+++ b/reports/MLOps_Assignment_01_Final_Report.docx
@@ -408,7 +408,35 @@
           <w:sz w:val="22"/>
           <w:szCs w:val="22"/>
         </w:rPr>
-        <w:t xml:space="preserve">12. Conclusion</w:t>
+        <w:t xml:space="preserve">13. Pipeline Demo Video</w:t>
+      </w:r>
+    </w:p>
+    <w:p>
+      <w:pPr>
+        <w:spacing w:after="120" w:line="276"/>
+      </w:pPr>
+      <w:r>
+        <w:rPr>
+          <w:rFonts w:ascii="Calibri" w:cs="Calibri" w:eastAsia="Calibri" w:hAnsi="Calibri"/>
+          <w:color w:val="1a56db"/>
+          <w:sz w:val="22"/>
+          <w:szCs w:val="22"/>
+        </w:rPr>
+        <w:t xml:space="preserve">14. Live Public API Deployment</w:t>
+      </w:r>
+    </w:p>
+    <w:p>
+      <w:pPr>
+        <w:spacing w:after="120" w:line="276"/>
+      </w:pPr>
+      <w:r>
+        <w:rPr>
+          <w:rFonts w:ascii="Calibri" w:cs="Calibri" w:eastAsia="Calibri" w:hAnsi="Calibri"/>
+          <w:color w:val="1a56db"/>
+          <w:sz w:val="22"/>
+          <w:szCs w:val="22"/>
+        </w:rPr>
+        <w:t xml:space="preserve">15. Conclusion</w:t>
       </w:r>
     </w:p>
     <w:p>
@@ -5069,7 +5097,182 @@
           <w:bCs/>
           <w:color w:val="1a56db"/>
         </w:rPr>
-        <w:t xml:space="preserve">13. Conclusion</w:t>
+        <w:t xml:space="preserve">13. Pipeline Demo Video</w:t>
+      </w:r>
+    </w:p>
+    <w:p>
+      <w:pPr>
+        <w:spacing w:after="120" w:line="276"/>
+      </w:pPr>
+      <w:r>
+        <w:rPr>
+          <w:rFonts w:ascii="Calibri" w:cs="Calibri" w:eastAsia="Calibri" w:hAnsi="Calibri"/>
+          <w:sz w:val="22"/>
+          <w:szCs w:val="22"/>
+        </w:rPr>
+        <w:t xml:space="preserve">A 2-minute terminal-style screen recording demonstrates the complete pipeline execution across 12 stages: project structure, data acquisition, EDA, model training with GridSearchCV, MLflow experiment tracking, pytest (29 tests), Docker multi-stage build, API endpoint testing, Kubernetes deployment with Helm, Prometheus monitoring, live Render deployment, and GitHub Actions CI/CD (5-stage pipeline passing).</w:t>
+      </w:r>
+    </w:p>
+    <w:p>
+      <w:pPr>
+        <w:spacing w:after="60" w:line="276"/>
+      </w:pPr>
+      <w:r>
+        <w:rPr>
+          <w:rFonts w:ascii="Calibri" w:cs="Calibri" w:eastAsia="Calibri" w:hAnsi="Calibri"/>
+          <w:b/>
+          <w:sz w:val="22"/>
+          <w:szCs w:val="22"/>
+        </w:rPr>
+        <w:t xml:space="preserve">Video Link: </w:t>
+      </w:r>
+      <w:r>
+        <w:rPr>
+          <w:rFonts w:ascii="Calibri" w:cs="Calibri" w:eastAsia="Calibri" w:hAnsi="Calibri"/>
+          <w:color w:val="1a56db"/>
+          <w:sz w:val="22"/>
+          <w:szCs w:val="22"/>
+          <w:u w:val="single"/>
+        </w:rPr>
+        <w:t xml:space="preserve">https://github.com/veerusgithub/heart-mlops/blob/main/reports/pipeline_demo_video.mp4</w:t>
+      </w:r>
+    </w:p>
+    <w:p>
+      <w:pPr>
+        <w:spacing w:after="0"/>
+      </w:pPr>
+    </w:p>
+    <w:p>
+      <w:pPr>
+        <w:pStyle w:val="Heading1"/>
+        <w:spacing w:after="120" w:before="300"/>
+      </w:pPr>
+      <w:r>
+        <w:rPr>
+          <w:rFonts w:ascii="Calibri" w:cs="Calibri" w:eastAsia="Calibri" w:hAnsi="Calibri"/>
+          <w:b/>
+          <w:bCs/>
+          <w:color w:val="1a56db"/>
+        </w:rPr>
+        <w:t xml:space="preserve">14. Live Public API Deployment</w:t>
+      </w:r>
+    </w:p>
+    <w:p>
+      <w:pPr>
+        <w:spacing w:after="120" w:line="276"/>
+      </w:pPr>
+      <w:r>
+        <w:rPr>
+          <w:rFonts w:ascii="Calibri" w:cs="Calibri" w:eastAsia="Calibri" w:hAnsi="Calibri"/>
+          <w:sz w:val="22"/>
+          <w:szCs w:val="22"/>
+        </w:rPr>
+        <w:t xml:space="preserve">The Heart Disease Risk Prediction API is deployed on Render (free tier) and publicly accessible. The deployment uses the same Docker image built by the CI/CD pipeline, with automatic deploys triggered on push to main.</w:t>
+      </w:r>
+    </w:p>
+    <w:p>
+      <w:pPr>
+        <w:spacing w:after="60" w:line="276"/>
+      </w:pPr>
+      <w:r>
+        <w:rPr>
+          <w:rFonts w:ascii="Calibri" w:cs="Calibri" w:eastAsia="Calibri" w:hAnsi="Calibri"/>
+          <w:b/>
+          <w:sz w:val="22"/>
+          <w:szCs w:val="22"/>
+        </w:rPr>
+        <w:t xml:space="preserve">Live API: </w:t>
+      </w:r>
+      <w:r>
+        <w:rPr>
+          <w:rFonts w:ascii="Calibri" w:cs="Calibri" w:eastAsia="Calibri" w:hAnsi="Calibri"/>
+          <w:color w:val="1a56db"/>
+          <w:sz w:val="22"/>
+          <w:szCs w:val="22"/>
+          <w:u w:val="single"/>
+        </w:rPr>
+        <w:t xml:space="preserve">https://heart-mlops.onrender.com</w:t>
+      </w:r>
+    </w:p>
+    <w:p>
+      <w:pPr>
+        <w:spacing w:after="60" w:line="276"/>
+      </w:pPr>
+      <w:r>
+        <w:rPr>
+          <w:rFonts w:ascii="Calibri" w:cs="Calibri" w:eastAsia="Calibri" w:hAnsi="Calibri"/>
+          <w:b/>
+          <w:sz w:val="22"/>
+          <w:szCs w:val="22"/>
+        </w:rPr>
+        <w:t xml:space="preserve">Swagger UI: </w:t>
+      </w:r>
+      <w:r>
+        <w:rPr>
+          <w:rFonts w:ascii="Calibri" w:cs="Calibri" w:eastAsia="Calibri" w:hAnsi="Calibri"/>
+          <w:color w:val="1a56db"/>
+          <w:sz w:val="22"/>
+          <w:szCs w:val="22"/>
+          <w:u w:val="single"/>
+        </w:rPr>
+        <w:t xml:space="preserve">https://heart-mlops.onrender.com/docs</w:t>
+      </w:r>
+    </w:p>
+    <w:p>
+      <w:pPr>
+        <w:spacing w:after="60" w:line="276"/>
+      </w:pPr>
+      <w:r>
+        <w:rPr>
+          <w:rFonts w:ascii="Calibri" w:cs="Calibri" w:eastAsia="Calibri" w:hAnsi="Calibri"/>
+          <w:b/>
+          <w:sz w:val="22"/>
+          <w:szCs w:val="22"/>
+        </w:rPr>
+        <w:t xml:space="preserve">Health Check: </w:t>
+      </w:r>
+      <w:r>
+        <w:rPr>
+          <w:rFonts w:ascii="Calibri" w:cs="Calibri" w:eastAsia="Calibri" w:hAnsi="Calibri"/>
+          <w:color w:val="1a56db"/>
+          <w:sz w:val="22"/>
+          <w:szCs w:val="22"/>
+          <w:u w:val="single"/>
+        </w:rPr>
+        <w:t xml:space="preserve">https://heart-mlops.onrender.com/health</w:t>
+      </w:r>
+    </w:p>
+    <w:p>
+      <w:pPr>
+        <w:spacing w:after="120" w:line="276"/>
+      </w:pPr>
+      <w:r>
+        <w:rPr>
+          <w:rFonts w:ascii="Calibri" w:cs="Calibri" w:eastAsia="Calibri" w:hAnsi="Calibri"/>
+          <w:sz w:val="22"/>
+          <w:szCs w:val="22"/>
+        </w:rPr>
+        <w:t xml:space="preserve">Endpoints available: GET /health (liveness), POST /predict (single prediction), POST /predict/batch (batch prediction), GET /metrics (Prometheus metrics).</w:t>
+      </w:r>
+    </w:p>
+    <w:p>
+      <w:pPr>
+        <w:spacing w:after="0"/>
+      </w:pPr>
+    </w:p>
+    <w:p>
+      <w:pPr>
+        <w:pStyle w:val="Heading1"/>
+        <w:spacing w:after="120" w:before="300"/>
+      </w:pPr>
+      <w:r>
+        <w:rPr>
+          <w:rFonts w:ascii="Calibri" w:cs="Calibri" w:eastAsia="Calibri" w:hAnsi="Calibri"/>
+          <w:b/>
+          <w:bCs/>
+          <w:color w:val="1a56db"/>
+        </w:rPr>
+        <w:t xml:space="preserve">15. Conclusion</w:t>
       </w:r>
     </w:p>
     <w:p>

</xml_diff>

<commit_message>
Add Helm deployment screenshot to final report
Include Figure 14 (Helm Chart Deployment) in section 8.2 showing
helm install, helm list, kubectl get pods/svc/hpa output.

Co-Authored-By: Claude Opus 4.6 <noreply@anthropic.com>
Claude-Session: https://claude.ai/code/session_01RNBTeDu5BDurzfd9a5VVKW
</commit_message>
<xml_diff>
--- a/reports/MLOps_Assignment_01_Final_Report.docx
+++ b/reports/MLOps_Assignment_01_Final_Report.docx
@@ -87,14 +87,6 @@
           <w:szCs w:val="26"/>
         </w:rPr>
         <w:t xml:space="preserve">Machine Learning Operations (AIMLCZG523)</w:t>
-      </w:r>
-      <w:r>
-        <w:rPr>
-          <w:rFonts w:ascii="Calibri" w:cs="Calibri" w:eastAsia="Calibri" w:hAnsi="Calibri"/>
-          <w:color w:val="555555"/>
-          <w:sz w:val="26"/>
-          <w:szCs w:val="26"/>
-        </w:rPr>
         <w:br/>
         <w:t xml:space="preserve">
 Assignment 01 — 50 Marks</w:t>
@@ -155,14 +147,6 @@
           <w:szCs w:val="22"/>
         </w:rPr>
         <w:t xml:space="preserve">BITS Pilani — Work Integrated Learning Programme</w:t>
-      </w:r>
-      <w:r>
-        <w:rPr>
-          <w:rFonts w:ascii="Calibri" w:cs="Calibri" w:eastAsia="Calibri" w:hAnsi="Calibri"/>
-          <w:color w:val="555555"/>
-          <w:sz w:val="22"/>
-          <w:szCs w:val="22"/>
-        </w:rPr>
         <w:br/>
         <w:t xml:space="preserve">
 M.Tech in Artificial Intelligence &amp; Machine Learning</w:t>
@@ -3696,6 +3680,62 @@
     </w:p>
     <w:p>
       <w:pPr>
+        <w:spacing w:after="60"/>
+        <w:jc w:val="center"/>
+      </w:pPr>
+      <w:r>
+        <w:drawing>
+          <wp:inline distT="0" distB="0" distL="0" distR="0">
+            <wp:extent cx="5486400" cy="2345143"/>
+            <wp:docPr id="30" name="Helm Deployment"/>
+            <a:graphic xmlns:a="http://schemas.openxmlformats.org/drawingml/2006/main">
+              <a:graphicData uri="http://schemas.openxmlformats.org/drawingml/2006/picture">
+                <pic:pic xmlns:pic="http://schemas.openxmlformats.org/drawingml/2006/picture">
+                  <pic:nvPicPr>
+                    <pic:cNvPr id="30" name="helm_deployment.png"/>
+                    <pic:cNvPicPr/>
+                  </pic:nvPicPr>
+                  <pic:blipFill>
+                    <a:blip xmlns:r="http://schemas.openxmlformats.org/officeDocument/2006/relationships" r:embed="rId25"/>
+                    <a:stretch>
+                      <a:fillRect/>
+                    </a:stretch>
+                  </pic:blipFill>
+                  <pic:spPr>
+                    <a:xfrm>
+                      <a:off x="0" y="0"/>
+                      <a:ext cx="5486400" cy="2345143"/>
+                    </a:xfrm>
+                    <a:prstGeom prst="rect">
+                      <a:avLst/>
+                    </a:prstGeom>
+                  </pic:spPr>
+                </pic:pic>
+              </a:graphicData>
+            </a:graphic>
+          </wp:inline>
+        </w:drawing>
+      </w:r>
+    </w:p>
+    <w:p>
+      <w:pPr>
+        <w:spacing w:after="200"/>
+        <w:jc w:val="center"/>
+      </w:pPr>
+      <w:r>
+        <w:rPr>
+          <w:rFonts w:ascii="Calibri" w:hAnsi="Calibri"/>
+          <w:i/>
+          <w:iCs/>
+          <w:sz w:val="20"/>
+          <w:szCs w:val="20"/>
+          <w:color w:val="555555"/>
+        </w:rPr>
+        <w:t xml:space="preserve">Figure 14: Helm Chart Deployment — helm install, helm list, pods, service, and HPA</w:t>
+      </w:r>
+    </w:p>
+    <w:p>
+      <w:pPr>
         <w:pStyle w:val="Heading2"/>
         <w:spacing w:after="120" w:before="300"/>
       </w:pPr>

</xml_diff>